<commit_message>
feat: agregar guia transportista
</commit_message>
<xml_diff>
--- a/pesaje/analytica/Report/PrintActaEntregaTickets.docx
+++ b/pesaje/analytica/Report/PrintActaEntregaTickets.docx
@@ -1,6 +1,6 @@
 
 <file path=word/document.xml><?xml version="1.0" encoding="utf-8"?>
-<w:document xmlns:wpc="http://schemas.microsoft.com/office/word/2010/wordprocessingCanvas" xmlns:cx="http://schemas.microsoft.com/office/drawing/2014/chartex" xmlns:cx1="http://schemas.microsoft.com/office/drawing/2015/9/8/chartex" xmlns:cx2="http://schemas.microsoft.com/office/drawing/2015/10/21/chartex" xmlns:cx3="http://schemas.microsoft.com/office/drawing/2016/5/9/chartex" xmlns:cx4="http://schemas.microsoft.com/office/drawing/2016/5/10/chartex" xmlns:cx5="http://schemas.microsoft.com/office/drawing/2016/5/11/chartex" xmlns:cx6="http://schemas.microsoft.com/office/drawing/2016/5/12/chartex" xmlns:cx7="http://schemas.microsoft.com/office/drawing/2016/5/13/chartex" xmlns:cx8="http://schemas.microsoft.com/office/drawing/2016/5/14/chartex" xmlns:mc="http://schemas.openxmlformats.org/markup-compatibility/2006" xmlns:aink="http://schemas.microsoft.com/office/drawing/2016/ink" xmlns:am3d="http://schemas.microsoft.com/office/drawing/2017/model3d" xmlns:o="urn:schemas-microsoft-com:office:office" xmlns:oel="http://schemas.microsoft.com/office/2019/extlst" xmlns:r="http://schemas.openxmlformats.org/officeDocument/2006/relationships" xmlns:m="http://schemas.openxmlformats.org/officeDocument/2006/math" xmlns:v="urn:schemas-microsoft-com:vml" xmlns:wp14="http://schemas.microsoft.com/office/word/2010/wordprocessingDrawing" xmlns:wp="http://schemas.openxmlformats.org/drawingml/2006/wordprocessingDrawing" xmlns:w10="urn:schemas-microsoft-com:office:word" xmlns:w="http://schemas.openxmlformats.org/wordprocessingml/2006/main" xmlns:w14="http://schemas.microsoft.com/office/word/2010/wordml" xmlns:w15="http://schemas.microsoft.com/office/word/2012/wordml" xmlns:w16cei="http://schemas.microsoft.com/office/word/2026/wordml/cei" xmlns:w16cex="http://schemas.microsoft.com/office/word/2018/wordml/cex" xmlns:w16cid="http://schemas.microsoft.com/office/word/2016/wordml/cid" xmlns:w16="http://schemas.microsoft.com/office/word/2018/wordml" xmlns:w16du="http://schemas.microsoft.com/office/word/2023/wordml/word16du" xmlns:w16sdtdh="http://schemas.microsoft.com/office/word/2020/wordml/sdtdatahash" xmlns:w16sdtfl="http://schemas.microsoft.com/office/word/2024/wordml/sdtformatlock" xmlns:w16se="http://schemas.microsoft.com/office/word/2015/wordml/symex" xmlns:wpg="http://schemas.microsoft.com/office/word/2010/wordprocessingGroup" xmlns:wpi="http://schemas.microsoft.com/office/word/2010/wordprocessingInk" xmlns:wne="http://schemas.microsoft.com/office/word/2006/wordml" xmlns:wps="http://schemas.microsoft.com/office/word/2010/wordprocessingShape" mc:Ignorable="w14 w15 w16se w16cid w16 w16cex w16sdtdh w16sdtfl w16du wp14">
+<w:document xmlns:wpc="http://schemas.microsoft.com/office/word/2010/wordprocessingCanvas" xmlns:cx="http://schemas.microsoft.com/office/drawing/2014/chartex" xmlns:cx1="http://schemas.microsoft.com/office/drawing/2015/9/8/chartex" xmlns:cx2="http://schemas.microsoft.com/office/drawing/2015/10/21/chartex" xmlns:cx3="http://schemas.microsoft.com/office/drawing/2016/5/9/chartex" xmlns:cx4="http://schemas.microsoft.com/office/drawing/2016/5/10/chartex" xmlns:cx5="http://schemas.microsoft.com/office/drawing/2016/5/11/chartex" xmlns:cx6="http://schemas.microsoft.com/office/drawing/2016/5/12/chartex" xmlns:cx7="http://schemas.microsoft.com/office/drawing/2016/5/13/chartex" xmlns:cx8="http://schemas.microsoft.com/office/drawing/2016/5/14/chartex" xmlns:mc="http://schemas.openxmlformats.org/markup-compatibility/2006" xmlns:aink="http://schemas.microsoft.com/office/drawing/2016/ink" xmlns:am3d="http://schemas.microsoft.com/office/drawing/2017/model3d" xmlns:o="urn:schemas-microsoft-com:office:office" xmlns:oel="http://schemas.microsoft.com/office/2019/extlst" xmlns:r="http://schemas.openxmlformats.org/officeDocument/2006/relationships" xmlns:m="http://schemas.openxmlformats.org/officeDocument/2006/math" xmlns:v="urn:schemas-microsoft-com:vml" xmlns:wp14="http://schemas.microsoft.com/office/word/2010/wordprocessingDrawing" xmlns:wp="http://schemas.openxmlformats.org/drawingml/2006/wordprocessingDrawing" xmlns:w10="urn:schemas-microsoft-com:office:word" xmlns:w="http://schemas.openxmlformats.org/wordprocessingml/2006/main" xmlns:w14="http://schemas.microsoft.com/office/word/2010/wordml" xmlns:w15="http://schemas.microsoft.com/office/word/2012/wordml" xmlns:w16cex="http://schemas.microsoft.com/office/word/2018/wordml/cex" xmlns:w16cid="http://schemas.microsoft.com/office/word/2016/wordml/cid" xmlns:w16="http://schemas.microsoft.com/office/word/2018/wordml" xmlns:w16du="http://schemas.microsoft.com/office/word/2023/wordml/word16du" xmlns:w16sdtdh="http://schemas.microsoft.com/office/word/2020/wordml/sdtdatahash" xmlns:w16sdtfl="http://schemas.microsoft.com/office/word/2024/wordml/sdtformatlock" xmlns:w16se="http://schemas.microsoft.com/office/word/2015/wordml/symex" xmlns:wpg="http://schemas.microsoft.com/office/word/2010/wordprocessingGroup" xmlns:wpi="http://schemas.microsoft.com/office/word/2010/wordprocessingInk" xmlns:wne="http://schemas.microsoft.com/office/word/2006/wordml" xmlns:wps="http://schemas.microsoft.com/office/word/2010/wordprocessingShape" mc:Ignorable="w14 w15 w16se w16cid w16 w16cex w16sdtdh w16sdtfl w16du wp14">
   <w:body>
     <w:p>
       <w:pPr>
@@ -124,7 +124,7 @@
               </wp:anchor>
             </w:drawing>
           </mc:Choice>
-          <mc:Fallback>
+          <mc:Fallback xmlns:w16cei="http://schemas.microsoft.com/office/word/2026/wordml/cei">
             <w:pict>
               <v:roundrect w14:anchorId="41E2BE62" id="Rectángulo: esquinas redondeadas 1987062048" o:spid="_x0000_s1026" style="position:absolute;margin-left:-2.1pt;margin-top:-13.15pt;width:179.6pt;height:60pt;z-index:251658240;visibility:visible;mso-wrap-style:square;mso-wrap-distance-left:9pt;mso-wrap-distance-top:0;mso-wrap-distance-right:9pt;mso-wrap-distance-bottom:0;mso-position-horizontal:absolute;mso-position-horizontal-relative:text;mso-position-vertical:absolute;mso-position-vertical-relative:text;v-text-anchor:top" arcsize="10923f" o:gfxdata="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" filled="f" stroked="f">
                 <v:stroke joinstyle="miter"/>
@@ -709,6 +709,7 @@
                 <w:szCs w:val="16"/>
               </w:rPr>
             </w:pPr>
+            <w:proofErr w:type="gramStart"/>
             <w:r>
               <w:rPr>
                 <w:rFonts w:ascii="Arial" w:hAnsi="Arial" w:cs="Arial"/>
@@ -719,8 +720,35 @@
                 <w:szCs w:val="16"/>
                 <w:lang w:val="es-PE"/>
               </w:rPr>
-              <w:t>Ticket de Pesaje N°</w:t>
-            </w:r>
+              <w:t>Ticket</w:t>
+            </w:r>
+            <w:proofErr w:type="gramEnd"/>
+            <w:r>
+              <w:rPr>
+                <w:rFonts w:ascii="Arial" w:hAnsi="Arial" w:cs="Arial"/>
+                <w:b/>
+                <w:bCs/>
+                <w:color w:val="000000" w:themeColor="text1"/>
+                <w:sz w:val="16"/>
+                <w:szCs w:val="16"/>
+                <w:lang w:val="es-PE"/>
+              </w:rPr>
+              <w:t xml:space="preserve"> de Pesaje </w:t>
+            </w:r>
+            <w:proofErr w:type="spellStart"/>
+            <w:r>
+              <w:rPr>
+                <w:rFonts w:ascii="Arial" w:hAnsi="Arial" w:cs="Arial"/>
+                <w:b/>
+                <w:bCs/>
+                <w:color w:val="000000" w:themeColor="text1"/>
+                <w:sz w:val="16"/>
+                <w:szCs w:val="16"/>
+                <w:lang w:val="es-PE"/>
+              </w:rPr>
+              <w:t>N°</w:t>
+            </w:r>
+            <w:proofErr w:type="spellEnd"/>
           </w:p>
         </w:tc>
         <w:tc>
@@ -2053,6 +2081,7 @@
                 <w:szCs w:val="16"/>
               </w:rPr>
             </w:pPr>
+            <w:proofErr w:type="spellStart"/>
             <w:r>
               <w:rPr>
                 <w:rFonts w:ascii="Arial" w:hAnsi="Arial" w:cs="Arial"/>
@@ -2063,7 +2092,20 @@
                 <w:szCs w:val="16"/>
                 <w:lang w:val="es-PE"/>
               </w:rPr>
-              <w:t>N° Doc / Guia R.</w:t>
+              <w:t>N°</w:t>
+            </w:r>
+            <w:proofErr w:type="spellEnd"/>
+            <w:r>
+              <w:rPr>
+                <w:rFonts w:ascii="Arial" w:hAnsi="Arial" w:cs="Arial"/>
+                <w:b/>
+                <w:bCs/>
+                <w:color w:val="000000" w:themeColor="text1"/>
+                <w:sz w:val="16"/>
+                <w:szCs w:val="16"/>
+                <w:lang w:val="es-PE"/>
+              </w:rPr>
+              <w:t xml:space="preserve"> Doc / Guia R.</w:t>
             </w:r>
           </w:p>
         </w:tc>
@@ -2240,6 +2282,56 @@
                 <w:lang w:val="es-PE"/>
               </w:rPr>
             </w:pPr>
+            <w:proofErr w:type="spellStart"/>
+            <w:r>
+              <w:rPr>
+                <w:rFonts w:ascii="Arial" w:hAnsi="Arial" w:cs="Arial"/>
+                <w:b/>
+                <w:bCs/>
+                <w:color w:val="000000" w:themeColor="text1"/>
+                <w:sz w:val="16"/>
+                <w:szCs w:val="16"/>
+                <w:lang w:val="es-PE"/>
+              </w:rPr>
+              <w:t>N°</w:t>
+            </w:r>
+            <w:proofErr w:type="spellEnd"/>
+            <w:r>
+              <w:rPr>
+                <w:rFonts w:ascii="Arial" w:hAnsi="Arial" w:cs="Arial"/>
+                <w:b/>
+                <w:bCs/>
+                <w:color w:val="000000" w:themeColor="text1"/>
+                <w:sz w:val="16"/>
+                <w:szCs w:val="16"/>
+                <w:lang w:val="es-PE"/>
+              </w:rPr>
+              <w:t xml:space="preserve"> Doc / Guia </w:t>
+            </w:r>
+            <w:r>
+              <w:rPr>
+                <w:rFonts w:ascii="Arial" w:hAnsi="Arial" w:cs="Arial"/>
+                <w:b/>
+                <w:bCs/>
+                <w:color w:val="000000" w:themeColor="text1"/>
+                <w:sz w:val="16"/>
+                <w:szCs w:val="16"/>
+                <w:lang w:val="es-PE"/>
+              </w:rPr>
+              <w:t>T</w:t>
+            </w:r>
+            <w:r>
+              <w:rPr>
+                <w:rFonts w:ascii="Arial" w:hAnsi="Arial" w:cs="Arial"/>
+                <w:b/>
+                <w:bCs/>
+                <w:color w:val="000000" w:themeColor="text1"/>
+                <w:sz w:val="16"/>
+                <w:szCs w:val="16"/>
+                <w:lang w:val="es-PE"/>
+              </w:rPr>
+              <w:t>.</w:t>
+            </w:r>
           </w:p>
         </w:tc>
         <w:tc>
@@ -2257,6 +2349,52 @@
                 <w:szCs w:val="16"/>
               </w:rPr>
             </w:pPr>
+            <w:r>
+              <w:rPr>
+                <w:rFonts w:ascii="Arial" w:hAnsi="Arial" w:cs="Arial"/>
+                <w:color w:val="000000" w:themeColor="text1"/>
+                <w:sz w:val="16"/>
+                <w:szCs w:val="16"/>
+              </w:rPr>
+              <w:fldChar w:fldCharType="begin"/>
+            </w:r>
+            <w:r>
+              <w:rPr>
+                <w:rFonts w:ascii="Arial" w:hAnsi="Arial" w:cs="Arial"/>
+                <w:color w:val="000000" w:themeColor="text1"/>
+                <w:sz w:val="16"/>
+                <w:szCs w:val="16"/>
+              </w:rPr>
+              <w:instrText xml:space="preserve"> MERGEFIELD  guia_tr  \* MERGEFORMAT </w:instrText>
+            </w:r>
+            <w:r>
+              <w:rPr>
+                <w:rFonts w:ascii="Arial" w:hAnsi="Arial" w:cs="Arial"/>
+                <w:color w:val="000000" w:themeColor="text1"/>
+                <w:sz w:val="16"/>
+                <w:szCs w:val="16"/>
+              </w:rPr>
+              <w:fldChar w:fldCharType="separate"/>
+            </w:r>
+            <w:r>
+              <w:rPr>
+                <w:rFonts w:ascii="Arial" w:hAnsi="Arial" w:cs="Arial"/>
+                <w:noProof/>
+                <w:color w:val="000000" w:themeColor="text1"/>
+                <w:sz w:val="16"/>
+                <w:szCs w:val="16"/>
+              </w:rPr>
+              <w:t>«guia_tr»</w:t>
+            </w:r>
+            <w:r>
+              <w:rPr>
+                <w:rFonts w:ascii="Arial" w:hAnsi="Arial" w:cs="Arial"/>
+                <w:color w:val="000000" w:themeColor="text1"/>
+                <w:sz w:val="16"/>
+                <w:szCs w:val="16"/>
+              </w:rPr>
+              <w:fldChar w:fldCharType="end"/>
+            </w:r>
           </w:p>
         </w:tc>
         <w:tc>
@@ -4615,7 +4753,7 @@
 </file>
 
 <file path=word/endnotes.xml><?xml version="1.0" encoding="utf-8"?>
-<w:endnotes xmlns:wpc="http://schemas.microsoft.com/office/word/2010/wordprocessingCanvas" xmlns:cx="http://schemas.microsoft.com/office/drawing/2014/chartex" xmlns:cx1="http://schemas.microsoft.com/office/drawing/2015/9/8/chartex" xmlns:cx2="http://schemas.microsoft.com/office/drawing/2015/10/21/chartex" xmlns:cx3="http://schemas.microsoft.com/office/drawing/2016/5/9/chartex" xmlns:cx4="http://schemas.microsoft.com/office/drawing/2016/5/10/chartex" xmlns:cx5="http://schemas.microsoft.com/office/drawing/2016/5/11/chartex" xmlns:cx6="http://schemas.microsoft.com/office/drawing/2016/5/12/chartex" xmlns:cx7="http://schemas.microsoft.com/office/drawing/2016/5/13/chartex" xmlns:cx8="http://schemas.microsoft.com/office/drawing/2016/5/14/chartex" xmlns:mc="http://schemas.openxmlformats.org/markup-compatibility/2006" xmlns:aink="http://schemas.microsoft.com/office/drawing/2016/ink" xmlns:am3d="http://schemas.microsoft.com/office/drawing/2017/model3d" xmlns:o="urn:schemas-microsoft-com:office:office" xmlns:oel="http://schemas.microsoft.com/office/2019/extlst" xmlns:r="http://schemas.openxmlformats.org/officeDocument/2006/relationships" xmlns:m="http://schemas.openxmlformats.org/officeDocument/2006/math" xmlns:v="urn:schemas-microsoft-com:vml" xmlns:wp14="http://schemas.microsoft.com/office/word/2010/wordprocessingDrawing" xmlns:wp="http://schemas.openxmlformats.org/drawingml/2006/wordprocessingDrawing" xmlns:w10="urn:schemas-microsoft-com:office:word" xmlns:w="http://schemas.openxmlformats.org/wordprocessingml/2006/main" xmlns:w14="http://schemas.microsoft.com/office/word/2010/wordml" xmlns:w15="http://schemas.microsoft.com/office/word/2012/wordml" xmlns:w16cei="http://schemas.microsoft.com/office/word/2026/wordml/cei" xmlns:w16cex="http://schemas.microsoft.com/office/word/2018/wordml/cex" xmlns:w16cid="http://schemas.microsoft.com/office/word/2016/wordml/cid" xmlns:w16="http://schemas.microsoft.com/office/word/2018/wordml" xmlns:w16du="http://schemas.microsoft.com/office/word/2023/wordml/word16du" xmlns:w16sdtdh="http://schemas.microsoft.com/office/word/2020/wordml/sdtdatahash" xmlns:w16sdtfl="http://schemas.microsoft.com/office/word/2024/wordml/sdtformatlock" xmlns:w16se="http://schemas.microsoft.com/office/word/2015/wordml/symex" xmlns:wpg="http://schemas.microsoft.com/office/word/2010/wordprocessingGroup" xmlns:wpi="http://schemas.microsoft.com/office/word/2010/wordprocessingInk" xmlns:wne="http://schemas.microsoft.com/office/word/2006/wordml" xmlns:wps="http://schemas.microsoft.com/office/word/2010/wordprocessingShape" mc:Ignorable="w14 w15 w16se w16cid w16 w16cex w16sdtdh w16sdtfl w16du wp14">
+<w:endnotes xmlns:wpc="http://schemas.microsoft.com/office/word/2010/wordprocessingCanvas" xmlns:cx="http://schemas.microsoft.com/office/drawing/2014/chartex" xmlns:cx1="http://schemas.microsoft.com/office/drawing/2015/9/8/chartex" xmlns:cx2="http://schemas.microsoft.com/office/drawing/2015/10/21/chartex" xmlns:cx3="http://schemas.microsoft.com/office/drawing/2016/5/9/chartex" xmlns:cx4="http://schemas.microsoft.com/office/drawing/2016/5/10/chartex" xmlns:cx5="http://schemas.microsoft.com/office/drawing/2016/5/11/chartex" xmlns:cx6="http://schemas.microsoft.com/office/drawing/2016/5/12/chartex" xmlns:cx7="http://schemas.microsoft.com/office/drawing/2016/5/13/chartex" xmlns:cx8="http://schemas.microsoft.com/office/drawing/2016/5/14/chartex" xmlns:mc="http://schemas.openxmlformats.org/markup-compatibility/2006" xmlns:aink="http://schemas.microsoft.com/office/drawing/2016/ink" xmlns:am3d="http://schemas.microsoft.com/office/drawing/2017/model3d" xmlns:o="urn:schemas-microsoft-com:office:office" xmlns:oel="http://schemas.microsoft.com/office/2019/extlst" xmlns:r="http://schemas.openxmlformats.org/officeDocument/2006/relationships" xmlns:m="http://schemas.openxmlformats.org/officeDocument/2006/math" xmlns:v="urn:schemas-microsoft-com:vml" xmlns:wp14="http://schemas.microsoft.com/office/word/2010/wordprocessingDrawing" xmlns:wp="http://schemas.openxmlformats.org/drawingml/2006/wordprocessingDrawing" xmlns:w10="urn:schemas-microsoft-com:office:word" xmlns:w="http://schemas.openxmlformats.org/wordprocessingml/2006/main" xmlns:w14="http://schemas.microsoft.com/office/word/2010/wordml" xmlns:w15="http://schemas.microsoft.com/office/word/2012/wordml" xmlns:w16cex="http://schemas.microsoft.com/office/word/2018/wordml/cex" xmlns:w16cid="http://schemas.microsoft.com/office/word/2016/wordml/cid" xmlns:w16="http://schemas.microsoft.com/office/word/2018/wordml" xmlns:w16du="http://schemas.microsoft.com/office/word/2023/wordml/word16du" xmlns:w16sdtdh="http://schemas.microsoft.com/office/word/2020/wordml/sdtdatahash" xmlns:w16sdtfl="http://schemas.microsoft.com/office/word/2024/wordml/sdtformatlock" xmlns:w16se="http://schemas.microsoft.com/office/word/2015/wordml/symex" xmlns:wpg="http://schemas.microsoft.com/office/word/2010/wordprocessingGroup" xmlns:wpi="http://schemas.microsoft.com/office/word/2010/wordprocessingInk" xmlns:wne="http://schemas.microsoft.com/office/word/2006/wordml" xmlns:wps="http://schemas.microsoft.com/office/word/2010/wordprocessingShape" mc:Ignorable="w14 w15 w16se w16cid w16 w16cex w16sdtdh w16sdtfl w16du wp14">
   <w:endnote w:type="separator" w:id="-1">
     <w:p>
       <w:pPr>
@@ -4640,7 +4778,7 @@
 </file>
 
 <file path=word/footer1.xml><?xml version="1.0" encoding="utf-8"?>
-<w:ftr xmlns:wpc="http://schemas.microsoft.com/office/word/2010/wordprocessingCanvas" xmlns:cx="http://schemas.microsoft.com/office/drawing/2014/chartex" xmlns:cx1="http://schemas.microsoft.com/office/drawing/2015/9/8/chartex" xmlns:cx2="http://schemas.microsoft.com/office/drawing/2015/10/21/chartex" xmlns:cx3="http://schemas.microsoft.com/office/drawing/2016/5/9/chartex" xmlns:cx4="http://schemas.microsoft.com/office/drawing/2016/5/10/chartex" xmlns:cx5="http://schemas.microsoft.com/office/drawing/2016/5/11/chartex" xmlns:cx6="http://schemas.microsoft.com/office/drawing/2016/5/12/chartex" xmlns:cx7="http://schemas.microsoft.com/office/drawing/2016/5/13/chartex" xmlns:cx8="http://schemas.microsoft.com/office/drawing/2016/5/14/chartex" xmlns:mc="http://schemas.openxmlformats.org/markup-compatibility/2006" xmlns:aink="http://schemas.microsoft.com/office/drawing/2016/ink" xmlns:am3d="http://schemas.microsoft.com/office/drawing/2017/model3d" xmlns:o="urn:schemas-microsoft-com:office:office" xmlns:oel="http://schemas.microsoft.com/office/2019/extlst" xmlns:r="http://schemas.openxmlformats.org/officeDocument/2006/relationships" xmlns:m="http://schemas.openxmlformats.org/officeDocument/2006/math" xmlns:v="urn:schemas-microsoft-com:vml" xmlns:wp14="http://schemas.microsoft.com/office/word/2010/wordprocessingDrawing" xmlns:wp="http://schemas.openxmlformats.org/drawingml/2006/wordprocessingDrawing" xmlns:w10="urn:schemas-microsoft-com:office:word" xmlns:w="http://schemas.openxmlformats.org/wordprocessingml/2006/main" xmlns:w14="http://schemas.microsoft.com/office/word/2010/wordml" xmlns:w15="http://schemas.microsoft.com/office/word/2012/wordml" xmlns:w16cei="http://schemas.microsoft.com/office/word/2026/wordml/cei" xmlns:w16cex="http://schemas.microsoft.com/office/word/2018/wordml/cex" xmlns:w16cid="http://schemas.microsoft.com/office/word/2016/wordml/cid" xmlns:w16="http://schemas.microsoft.com/office/word/2018/wordml" xmlns:w16du="http://schemas.microsoft.com/office/word/2023/wordml/word16du" xmlns:w16sdtdh="http://schemas.microsoft.com/office/word/2020/wordml/sdtdatahash" xmlns:w16sdtfl="http://schemas.microsoft.com/office/word/2024/wordml/sdtformatlock" xmlns:w16se="http://schemas.microsoft.com/office/word/2015/wordml/symex" xmlns:wpg="http://schemas.microsoft.com/office/word/2010/wordprocessingGroup" xmlns:wpi="http://schemas.microsoft.com/office/word/2010/wordprocessingInk" xmlns:wne="http://schemas.microsoft.com/office/word/2006/wordml" xmlns:wps="http://schemas.microsoft.com/office/word/2010/wordprocessingShape" mc:Ignorable="w14 w15 w16se w16cid w16 w16cex w16sdtdh w16sdtfl w16du wp14">
+<w:ftr xmlns:wpc="http://schemas.microsoft.com/office/word/2010/wordprocessingCanvas" xmlns:cx="http://schemas.microsoft.com/office/drawing/2014/chartex" xmlns:cx1="http://schemas.microsoft.com/office/drawing/2015/9/8/chartex" xmlns:cx2="http://schemas.microsoft.com/office/drawing/2015/10/21/chartex" xmlns:cx3="http://schemas.microsoft.com/office/drawing/2016/5/9/chartex" xmlns:cx4="http://schemas.microsoft.com/office/drawing/2016/5/10/chartex" xmlns:cx5="http://schemas.microsoft.com/office/drawing/2016/5/11/chartex" xmlns:cx6="http://schemas.microsoft.com/office/drawing/2016/5/12/chartex" xmlns:cx7="http://schemas.microsoft.com/office/drawing/2016/5/13/chartex" xmlns:cx8="http://schemas.microsoft.com/office/drawing/2016/5/14/chartex" xmlns:mc="http://schemas.openxmlformats.org/markup-compatibility/2006" xmlns:aink="http://schemas.microsoft.com/office/drawing/2016/ink" xmlns:am3d="http://schemas.microsoft.com/office/drawing/2017/model3d" xmlns:o="urn:schemas-microsoft-com:office:office" xmlns:oel="http://schemas.microsoft.com/office/2019/extlst" xmlns:r="http://schemas.openxmlformats.org/officeDocument/2006/relationships" xmlns:m="http://schemas.openxmlformats.org/officeDocument/2006/math" xmlns:v="urn:schemas-microsoft-com:vml" xmlns:wp14="http://schemas.microsoft.com/office/word/2010/wordprocessingDrawing" xmlns:wp="http://schemas.openxmlformats.org/drawingml/2006/wordprocessingDrawing" xmlns:w10="urn:schemas-microsoft-com:office:word" xmlns:w="http://schemas.openxmlformats.org/wordprocessingml/2006/main" xmlns:w14="http://schemas.microsoft.com/office/word/2010/wordml" xmlns:w15="http://schemas.microsoft.com/office/word/2012/wordml" xmlns:w16cex="http://schemas.microsoft.com/office/word/2018/wordml/cex" xmlns:w16cid="http://schemas.microsoft.com/office/word/2016/wordml/cid" xmlns:w16="http://schemas.microsoft.com/office/word/2018/wordml" xmlns:w16du="http://schemas.microsoft.com/office/word/2023/wordml/word16du" xmlns:w16sdtdh="http://schemas.microsoft.com/office/word/2020/wordml/sdtdatahash" xmlns:w16sdtfl="http://schemas.microsoft.com/office/word/2024/wordml/sdtformatlock" xmlns:w16se="http://schemas.microsoft.com/office/word/2015/wordml/symex" xmlns:wpg="http://schemas.microsoft.com/office/word/2010/wordprocessingGroup" xmlns:wpi="http://schemas.microsoft.com/office/word/2010/wordprocessingInk" xmlns:wne="http://schemas.microsoft.com/office/word/2006/wordml" xmlns:wps="http://schemas.microsoft.com/office/word/2010/wordprocessingShape" mc:Ignorable="w14 w15 w16se w16cid w16 w16cex w16sdtdh w16sdtfl w16du wp14">
   <w:p>
     <w:pPr>
       <w:pStyle w:val="Piedepgina"/>
@@ -4650,7 +4788,7 @@
 </file>
 
 <file path=word/footer2.xml><?xml version="1.0" encoding="utf-8"?>
-<w:ftr xmlns:wpc="http://schemas.microsoft.com/office/word/2010/wordprocessingCanvas" xmlns:cx="http://schemas.microsoft.com/office/drawing/2014/chartex" xmlns:cx1="http://schemas.microsoft.com/office/drawing/2015/9/8/chartex" xmlns:cx2="http://schemas.microsoft.com/office/drawing/2015/10/21/chartex" xmlns:cx3="http://schemas.microsoft.com/office/drawing/2016/5/9/chartex" xmlns:cx4="http://schemas.microsoft.com/office/drawing/2016/5/10/chartex" xmlns:cx5="http://schemas.microsoft.com/office/drawing/2016/5/11/chartex" xmlns:cx6="http://schemas.microsoft.com/office/drawing/2016/5/12/chartex" xmlns:cx7="http://schemas.microsoft.com/office/drawing/2016/5/13/chartex" xmlns:cx8="http://schemas.microsoft.com/office/drawing/2016/5/14/chartex" xmlns:mc="http://schemas.openxmlformats.org/markup-compatibility/2006" xmlns:aink="http://schemas.microsoft.com/office/drawing/2016/ink" xmlns:am3d="http://schemas.microsoft.com/office/drawing/2017/model3d" xmlns:o="urn:schemas-microsoft-com:office:office" xmlns:oel="http://schemas.microsoft.com/office/2019/extlst" xmlns:r="http://schemas.openxmlformats.org/officeDocument/2006/relationships" xmlns:m="http://schemas.openxmlformats.org/officeDocument/2006/math" xmlns:v="urn:schemas-microsoft-com:vml" xmlns:wp14="http://schemas.microsoft.com/office/word/2010/wordprocessingDrawing" xmlns:wp="http://schemas.openxmlformats.org/drawingml/2006/wordprocessingDrawing" xmlns:w10="urn:schemas-microsoft-com:office:word" xmlns:w="http://schemas.openxmlformats.org/wordprocessingml/2006/main" xmlns:w14="http://schemas.microsoft.com/office/word/2010/wordml" xmlns:w15="http://schemas.microsoft.com/office/word/2012/wordml" xmlns:w16cei="http://schemas.microsoft.com/office/word/2026/wordml/cei" xmlns:w16cex="http://schemas.microsoft.com/office/word/2018/wordml/cex" xmlns:w16cid="http://schemas.microsoft.com/office/word/2016/wordml/cid" xmlns:w16="http://schemas.microsoft.com/office/word/2018/wordml" xmlns:w16du="http://schemas.microsoft.com/office/word/2023/wordml/word16du" xmlns:w16sdtdh="http://schemas.microsoft.com/office/word/2020/wordml/sdtdatahash" xmlns:w16sdtfl="http://schemas.microsoft.com/office/word/2024/wordml/sdtformatlock" xmlns:w16se="http://schemas.microsoft.com/office/word/2015/wordml/symex" xmlns:wpg="http://schemas.microsoft.com/office/word/2010/wordprocessingGroup" xmlns:wpi="http://schemas.microsoft.com/office/word/2010/wordprocessingInk" xmlns:wne="http://schemas.microsoft.com/office/word/2006/wordml" xmlns:wps="http://schemas.microsoft.com/office/word/2010/wordprocessingShape" mc:Ignorable="w14 w15 w16se w16cid w16 w16cex w16sdtdh w16sdtfl w16du wp14">
+<w:ftr xmlns:wpc="http://schemas.microsoft.com/office/word/2010/wordprocessingCanvas" xmlns:cx="http://schemas.microsoft.com/office/drawing/2014/chartex" xmlns:cx1="http://schemas.microsoft.com/office/drawing/2015/9/8/chartex" xmlns:cx2="http://schemas.microsoft.com/office/drawing/2015/10/21/chartex" xmlns:cx3="http://schemas.microsoft.com/office/drawing/2016/5/9/chartex" xmlns:cx4="http://schemas.microsoft.com/office/drawing/2016/5/10/chartex" xmlns:cx5="http://schemas.microsoft.com/office/drawing/2016/5/11/chartex" xmlns:cx6="http://schemas.microsoft.com/office/drawing/2016/5/12/chartex" xmlns:cx7="http://schemas.microsoft.com/office/drawing/2016/5/13/chartex" xmlns:cx8="http://schemas.microsoft.com/office/drawing/2016/5/14/chartex" xmlns:mc="http://schemas.openxmlformats.org/markup-compatibility/2006" xmlns:aink="http://schemas.microsoft.com/office/drawing/2016/ink" xmlns:am3d="http://schemas.microsoft.com/office/drawing/2017/model3d" xmlns:o="urn:schemas-microsoft-com:office:office" xmlns:oel="http://schemas.microsoft.com/office/2019/extlst" xmlns:r="http://schemas.openxmlformats.org/officeDocument/2006/relationships" xmlns:m="http://schemas.openxmlformats.org/officeDocument/2006/math" xmlns:v="urn:schemas-microsoft-com:vml" xmlns:wp14="http://schemas.microsoft.com/office/word/2010/wordprocessingDrawing" xmlns:wp="http://schemas.openxmlformats.org/drawingml/2006/wordprocessingDrawing" xmlns:w10="urn:schemas-microsoft-com:office:word" xmlns:w="http://schemas.openxmlformats.org/wordprocessingml/2006/main" xmlns:w14="http://schemas.microsoft.com/office/word/2010/wordml" xmlns:w15="http://schemas.microsoft.com/office/word/2012/wordml" xmlns:w16cex="http://schemas.microsoft.com/office/word/2018/wordml/cex" xmlns:w16cid="http://schemas.microsoft.com/office/word/2016/wordml/cid" xmlns:w16="http://schemas.microsoft.com/office/word/2018/wordml" xmlns:w16du="http://schemas.microsoft.com/office/word/2023/wordml/word16du" xmlns:w16sdtdh="http://schemas.microsoft.com/office/word/2020/wordml/sdtdatahash" xmlns:w16sdtfl="http://schemas.microsoft.com/office/word/2024/wordml/sdtformatlock" xmlns:w16se="http://schemas.microsoft.com/office/word/2015/wordml/symex" xmlns:wpg="http://schemas.microsoft.com/office/word/2010/wordprocessingGroup" xmlns:wpi="http://schemas.microsoft.com/office/word/2010/wordprocessingInk" xmlns:wne="http://schemas.microsoft.com/office/word/2006/wordml" xmlns:wps="http://schemas.microsoft.com/office/word/2010/wordprocessingShape" mc:Ignorable="w14 w15 w16se w16cid w16 w16cex w16sdtdh w16sdtfl w16du wp14">
   <w:p>
     <w:pPr>
       <w:tabs>
@@ -4723,7 +4861,7 @@
             </wp:anchor>
           </w:drawing>
         </mc:Choice>
-        <mc:Fallback>
+        <mc:Fallback xmlns:w16cei="http://schemas.microsoft.com/office/word/2026/wordml/cei">
           <w:pict>
             <v:line w14:anchorId="41D8658E" id="Conector recto 1" o:spid="_x0000_s1026" style="position:absolute;z-index:251659264;visibility:visible;mso-wrap-style:square;mso-width-percent:0;mso-wrap-distance-left:9pt;mso-wrap-distance-top:0;mso-wrap-distance-right:9pt;mso-wrap-distance-bottom:0;mso-position-horizontal:absolute;mso-position-horizontal-relative:text;mso-position-vertical:absolute;mso-position-vertical-relative:text;mso-width-percent:0;mso-width-relative:margin" from="-15pt,8.2pt" to="560.5pt,8.2pt" o:gfxdata="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" strokecolor="#a5a5a5" strokeweight="2pt">
               <v:stroke joinstyle="miter"/>
@@ -4947,7 +5085,7 @@
 </file>
 
 <file path=word/footer3.xml><?xml version="1.0" encoding="utf-8"?>
-<w:ftr xmlns:wpc="http://schemas.microsoft.com/office/word/2010/wordprocessingCanvas" xmlns:cx="http://schemas.microsoft.com/office/drawing/2014/chartex" xmlns:cx1="http://schemas.microsoft.com/office/drawing/2015/9/8/chartex" xmlns:cx2="http://schemas.microsoft.com/office/drawing/2015/10/21/chartex" xmlns:cx3="http://schemas.microsoft.com/office/drawing/2016/5/9/chartex" xmlns:cx4="http://schemas.microsoft.com/office/drawing/2016/5/10/chartex" xmlns:cx5="http://schemas.microsoft.com/office/drawing/2016/5/11/chartex" xmlns:cx6="http://schemas.microsoft.com/office/drawing/2016/5/12/chartex" xmlns:cx7="http://schemas.microsoft.com/office/drawing/2016/5/13/chartex" xmlns:cx8="http://schemas.microsoft.com/office/drawing/2016/5/14/chartex" xmlns:mc="http://schemas.openxmlformats.org/markup-compatibility/2006" xmlns:aink="http://schemas.microsoft.com/office/drawing/2016/ink" xmlns:am3d="http://schemas.microsoft.com/office/drawing/2017/model3d" xmlns:o="urn:schemas-microsoft-com:office:office" xmlns:oel="http://schemas.microsoft.com/office/2019/extlst" xmlns:r="http://schemas.openxmlformats.org/officeDocument/2006/relationships" xmlns:m="http://schemas.openxmlformats.org/officeDocument/2006/math" xmlns:v="urn:schemas-microsoft-com:vml" xmlns:wp14="http://schemas.microsoft.com/office/word/2010/wordprocessingDrawing" xmlns:wp="http://schemas.openxmlformats.org/drawingml/2006/wordprocessingDrawing" xmlns:w10="urn:schemas-microsoft-com:office:word" xmlns:w="http://schemas.openxmlformats.org/wordprocessingml/2006/main" xmlns:w14="http://schemas.microsoft.com/office/word/2010/wordml" xmlns:w15="http://schemas.microsoft.com/office/word/2012/wordml" xmlns:w16cei="http://schemas.microsoft.com/office/word/2026/wordml/cei" xmlns:w16cex="http://schemas.microsoft.com/office/word/2018/wordml/cex" xmlns:w16cid="http://schemas.microsoft.com/office/word/2016/wordml/cid" xmlns:w16="http://schemas.microsoft.com/office/word/2018/wordml" xmlns:w16du="http://schemas.microsoft.com/office/word/2023/wordml/word16du" xmlns:w16sdtdh="http://schemas.microsoft.com/office/word/2020/wordml/sdtdatahash" xmlns:w16sdtfl="http://schemas.microsoft.com/office/word/2024/wordml/sdtformatlock" xmlns:w16se="http://schemas.microsoft.com/office/word/2015/wordml/symex" xmlns:wpg="http://schemas.microsoft.com/office/word/2010/wordprocessingGroup" xmlns:wpi="http://schemas.microsoft.com/office/word/2010/wordprocessingInk" xmlns:wne="http://schemas.microsoft.com/office/word/2006/wordml" xmlns:wps="http://schemas.microsoft.com/office/word/2010/wordprocessingShape" mc:Ignorable="w14 w15 w16se w16cid w16 w16cex w16sdtdh w16sdtfl w16du wp14">
+<w:ftr xmlns:wpc="http://schemas.microsoft.com/office/word/2010/wordprocessingCanvas" xmlns:cx="http://schemas.microsoft.com/office/drawing/2014/chartex" xmlns:cx1="http://schemas.microsoft.com/office/drawing/2015/9/8/chartex" xmlns:cx2="http://schemas.microsoft.com/office/drawing/2015/10/21/chartex" xmlns:cx3="http://schemas.microsoft.com/office/drawing/2016/5/9/chartex" xmlns:cx4="http://schemas.microsoft.com/office/drawing/2016/5/10/chartex" xmlns:cx5="http://schemas.microsoft.com/office/drawing/2016/5/11/chartex" xmlns:cx6="http://schemas.microsoft.com/office/drawing/2016/5/12/chartex" xmlns:cx7="http://schemas.microsoft.com/office/drawing/2016/5/13/chartex" xmlns:cx8="http://schemas.microsoft.com/office/drawing/2016/5/14/chartex" xmlns:mc="http://schemas.openxmlformats.org/markup-compatibility/2006" xmlns:aink="http://schemas.microsoft.com/office/drawing/2016/ink" xmlns:am3d="http://schemas.microsoft.com/office/drawing/2017/model3d" xmlns:o="urn:schemas-microsoft-com:office:office" xmlns:oel="http://schemas.microsoft.com/office/2019/extlst" xmlns:r="http://schemas.openxmlformats.org/officeDocument/2006/relationships" xmlns:m="http://schemas.openxmlformats.org/officeDocument/2006/math" xmlns:v="urn:schemas-microsoft-com:vml" xmlns:wp14="http://schemas.microsoft.com/office/word/2010/wordprocessingDrawing" xmlns:wp="http://schemas.openxmlformats.org/drawingml/2006/wordprocessingDrawing" xmlns:w10="urn:schemas-microsoft-com:office:word" xmlns:w="http://schemas.openxmlformats.org/wordprocessingml/2006/main" xmlns:w14="http://schemas.microsoft.com/office/word/2010/wordml" xmlns:w15="http://schemas.microsoft.com/office/word/2012/wordml" xmlns:w16cex="http://schemas.microsoft.com/office/word/2018/wordml/cex" xmlns:w16cid="http://schemas.microsoft.com/office/word/2016/wordml/cid" xmlns:w16="http://schemas.microsoft.com/office/word/2018/wordml" xmlns:w16du="http://schemas.microsoft.com/office/word/2023/wordml/word16du" xmlns:w16sdtdh="http://schemas.microsoft.com/office/word/2020/wordml/sdtdatahash" xmlns:w16sdtfl="http://schemas.microsoft.com/office/word/2024/wordml/sdtformatlock" xmlns:w16se="http://schemas.microsoft.com/office/word/2015/wordml/symex" xmlns:wpg="http://schemas.microsoft.com/office/word/2010/wordprocessingGroup" xmlns:wpi="http://schemas.microsoft.com/office/word/2010/wordprocessingInk" xmlns:wne="http://schemas.microsoft.com/office/word/2006/wordml" xmlns:wps="http://schemas.microsoft.com/office/word/2010/wordprocessingShape" mc:Ignorable="w14 w15 w16se w16cid w16 w16cex w16sdtdh w16sdtfl w16du wp14">
   <w:p>
     <w:pPr>
       <w:pStyle w:val="Piedepgina"/>
@@ -4957,7 +5095,7 @@
 </file>
 
 <file path=word/footnotes.xml><?xml version="1.0" encoding="utf-8"?>
-<w:footnotes xmlns:wpc="http://schemas.microsoft.com/office/word/2010/wordprocessingCanvas" xmlns:cx="http://schemas.microsoft.com/office/drawing/2014/chartex" xmlns:cx1="http://schemas.microsoft.com/office/drawing/2015/9/8/chartex" xmlns:cx2="http://schemas.microsoft.com/office/drawing/2015/10/21/chartex" xmlns:cx3="http://schemas.microsoft.com/office/drawing/2016/5/9/chartex" xmlns:cx4="http://schemas.microsoft.com/office/drawing/2016/5/10/chartex" xmlns:cx5="http://schemas.microsoft.com/office/drawing/2016/5/11/chartex" xmlns:cx6="http://schemas.microsoft.com/office/drawing/2016/5/12/chartex" xmlns:cx7="http://schemas.microsoft.com/office/drawing/2016/5/13/chartex" xmlns:cx8="http://schemas.microsoft.com/office/drawing/2016/5/14/chartex" xmlns:mc="http://schemas.openxmlformats.org/markup-compatibility/2006" xmlns:aink="http://schemas.microsoft.com/office/drawing/2016/ink" xmlns:am3d="http://schemas.microsoft.com/office/drawing/2017/model3d" xmlns:o="urn:schemas-microsoft-com:office:office" xmlns:oel="http://schemas.microsoft.com/office/2019/extlst" xmlns:r="http://schemas.openxmlformats.org/officeDocument/2006/relationships" xmlns:m="http://schemas.openxmlformats.org/officeDocument/2006/math" xmlns:v="urn:schemas-microsoft-com:vml" xmlns:wp14="http://schemas.microsoft.com/office/word/2010/wordprocessingDrawing" xmlns:wp="http://schemas.openxmlformats.org/drawingml/2006/wordprocessingDrawing" xmlns:w10="urn:schemas-microsoft-com:office:word" xmlns:w="http://schemas.openxmlformats.org/wordprocessingml/2006/main" xmlns:w14="http://schemas.microsoft.com/office/word/2010/wordml" xmlns:w15="http://schemas.microsoft.com/office/word/2012/wordml" xmlns:w16cei="http://schemas.microsoft.com/office/word/2026/wordml/cei" xmlns:w16cex="http://schemas.microsoft.com/office/word/2018/wordml/cex" xmlns:w16cid="http://schemas.microsoft.com/office/word/2016/wordml/cid" xmlns:w16="http://schemas.microsoft.com/office/word/2018/wordml" xmlns:w16du="http://schemas.microsoft.com/office/word/2023/wordml/word16du" xmlns:w16sdtdh="http://schemas.microsoft.com/office/word/2020/wordml/sdtdatahash" xmlns:w16sdtfl="http://schemas.microsoft.com/office/word/2024/wordml/sdtformatlock" xmlns:w16se="http://schemas.microsoft.com/office/word/2015/wordml/symex" xmlns:wpg="http://schemas.microsoft.com/office/word/2010/wordprocessingGroup" xmlns:wpi="http://schemas.microsoft.com/office/word/2010/wordprocessingInk" xmlns:wne="http://schemas.microsoft.com/office/word/2006/wordml" xmlns:wps="http://schemas.microsoft.com/office/word/2010/wordprocessingShape" mc:Ignorable="w14 w15 w16se w16cid w16 w16cex w16sdtdh w16sdtfl w16du wp14">
+<w:footnotes xmlns:wpc="http://schemas.microsoft.com/office/word/2010/wordprocessingCanvas" xmlns:cx="http://schemas.microsoft.com/office/drawing/2014/chartex" xmlns:cx1="http://schemas.microsoft.com/office/drawing/2015/9/8/chartex" xmlns:cx2="http://schemas.microsoft.com/office/drawing/2015/10/21/chartex" xmlns:cx3="http://schemas.microsoft.com/office/drawing/2016/5/9/chartex" xmlns:cx4="http://schemas.microsoft.com/office/drawing/2016/5/10/chartex" xmlns:cx5="http://schemas.microsoft.com/office/drawing/2016/5/11/chartex" xmlns:cx6="http://schemas.microsoft.com/office/drawing/2016/5/12/chartex" xmlns:cx7="http://schemas.microsoft.com/office/drawing/2016/5/13/chartex" xmlns:cx8="http://schemas.microsoft.com/office/drawing/2016/5/14/chartex" xmlns:mc="http://schemas.openxmlformats.org/markup-compatibility/2006" xmlns:aink="http://schemas.microsoft.com/office/drawing/2016/ink" xmlns:am3d="http://schemas.microsoft.com/office/drawing/2017/model3d" xmlns:o="urn:schemas-microsoft-com:office:office" xmlns:oel="http://schemas.microsoft.com/office/2019/extlst" xmlns:r="http://schemas.openxmlformats.org/officeDocument/2006/relationships" xmlns:m="http://schemas.openxmlformats.org/officeDocument/2006/math" xmlns:v="urn:schemas-microsoft-com:vml" xmlns:wp14="http://schemas.microsoft.com/office/word/2010/wordprocessingDrawing" xmlns:wp="http://schemas.openxmlformats.org/drawingml/2006/wordprocessingDrawing" xmlns:w10="urn:schemas-microsoft-com:office:word" xmlns:w="http://schemas.openxmlformats.org/wordprocessingml/2006/main" xmlns:w14="http://schemas.microsoft.com/office/word/2010/wordml" xmlns:w15="http://schemas.microsoft.com/office/word/2012/wordml" xmlns:w16cex="http://schemas.microsoft.com/office/word/2018/wordml/cex" xmlns:w16cid="http://schemas.microsoft.com/office/word/2016/wordml/cid" xmlns:w16="http://schemas.microsoft.com/office/word/2018/wordml" xmlns:w16du="http://schemas.microsoft.com/office/word/2023/wordml/word16du" xmlns:w16sdtdh="http://schemas.microsoft.com/office/word/2020/wordml/sdtdatahash" xmlns:w16sdtfl="http://schemas.microsoft.com/office/word/2024/wordml/sdtformatlock" xmlns:w16se="http://schemas.microsoft.com/office/word/2015/wordml/symex" xmlns:wpg="http://schemas.microsoft.com/office/word/2010/wordprocessingGroup" xmlns:wpi="http://schemas.microsoft.com/office/word/2010/wordprocessingInk" xmlns:wne="http://schemas.microsoft.com/office/word/2006/wordml" xmlns:wps="http://schemas.microsoft.com/office/word/2010/wordprocessingShape" mc:Ignorable="w14 w15 w16se w16cid w16 w16cex w16sdtdh w16sdtfl w16du wp14">
   <w:footnote w:type="separator" w:id="-1">
     <w:p>
       <w:pPr>
@@ -4982,7 +5120,7 @@
 </file>
 
 <file path=word/header1.xml><?xml version="1.0" encoding="utf-8"?>
-<w:hdr xmlns:wpc="http://schemas.microsoft.com/office/word/2010/wordprocessingCanvas" xmlns:cx="http://schemas.microsoft.com/office/drawing/2014/chartex" xmlns:cx1="http://schemas.microsoft.com/office/drawing/2015/9/8/chartex" xmlns:cx2="http://schemas.microsoft.com/office/drawing/2015/10/21/chartex" xmlns:cx3="http://schemas.microsoft.com/office/drawing/2016/5/9/chartex" xmlns:cx4="http://schemas.microsoft.com/office/drawing/2016/5/10/chartex" xmlns:cx5="http://schemas.microsoft.com/office/drawing/2016/5/11/chartex" xmlns:cx6="http://schemas.microsoft.com/office/drawing/2016/5/12/chartex" xmlns:cx7="http://schemas.microsoft.com/office/drawing/2016/5/13/chartex" xmlns:cx8="http://schemas.microsoft.com/office/drawing/2016/5/14/chartex" xmlns:mc="http://schemas.openxmlformats.org/markup-compatibility/2006" xmlns:aink="http://schemas.microsoft.com/office/drawing/2016/ink" xmlns:am3d="http://schemas.microsoft.com/office/drawing/2017/model3d" xmlns:o="urn:schemas-microsoft-com:office:office" xmlns:oel="http://schemas.microsoft.com/office/2019/extlst" xmlns:r="http://schemas.openxmlformats.org/officeDocument/2006/relationships" xmlns:m="http://schemas.openxmlformats.org/officeDocument/2006/math" xmlns:v="urn:schemas-microsoft-com:vml" xmlns:wp14="http://schemas.microsoft.com/office/word/2010/wordprocessingDrawing" xmlns:wp="http://schemas.openxmlformats.org/drawingml/2006/wordprocessingDrawing" xmlns:w10="urn:schemas-microsoft-com:office:word" xmlns:w="http://schemas.openxmlformats.org/wordprocessingml/2006/main" xmlns:w14="http://schemas.microsoft.com/office/word/2010/wordml" xmlns:w15="http://schemas.microsoft.com/office/word/2012/wordml" xmlns:w16cei="http://schemas.microsoft.com/office/word/2026/wordml/cei" xmlns:w16cex="http://schemas.microsoft.com/office/word/2018/wordml/cex" xmlns:w16cid="http://schemas.microsoft.com/office/word/2016/wordml/cid" xmlns:w16="http://schemas.microsoft.com/office/word/2018/wordml" xmlns:w16du="http://schemas.microsoft.com/office/word/2023/wordml/word16du" xmlns:w16sdtdh="http://schemas.microsoft.com/office/word/2020/wordml/sdtdatahash" xmlns:w16sdtfl="http://schemas.microsoft.com/office/word/2024/wordml/sdtformatlock" xmlns:w16se="http://schemas.microsoft.com/office/word/2015/wordml/symex" xmlns:wpg="http://schemas.microsoft.com/office/word/2010/wordprocessingGroup" xmlns:wpi="http://schemas.microsoft.com/office/word/2010/wordprocessingInk" xmlns:wne="http://schemas.microsoft.com/office/word/2006/wordml" xmlns:wps="http://schemas.microsoft.com/office/word/2010/wordprocessingShape" mc:Ignorable="w14 w15 w16se w16cid w16 w16cex w16sdtdh w16sdtfl w16du wp14">
+<w:hdr xmlns:wpc="http://schemas.microsoft.com/office/word/2010/wordprocessingCanvas" xmlns:cx="http://schemas.microsoft.com/office/drawing/2014/chartex" xmlns:cx1="http://schemas.microsoft.com/office/drawing/2015/9/8/chartex" xmlns:cx2="http://schemas.microsoft.com/office/drawing/2015/10/21/chartex" xmlns:cx3="http://schemas.microsoft.com/office/drawing/2016/5/9/chartex" xmlns:cx4="http://schemas.microsoft.com/office/drawing/2016/5/10/chartex" xmlns:cx5="http://schemas.microsoft.com/office/drawing/2016/5/11/chartex" xmlns:cx6="http://schemas.microsoft.com/office/drawing/2016/5/12/chartex" xmlns:cx7="http://schemas.microsoft.com/office/drawing/2016/5/13/chartex" xmlns:cx8="http://schemas.microsoft.com/office/drawing/2016/5/14/chartex" xmlns:mc="http://schemas.openxmlformats.org/markup-compatibility/2006" xmlns:aink="http://schemas.microsoft.com/office/drawing/2016/ink" xmlns:am3d="http://schemas.microsoft.com/office/drawing/2017/model3d" xmlns:o="urn:schemas-microsoft-com:office:office" xmlns:oel="http://schemas.microsoft.com/office/2019/extlst" xmlns:r="http://schemas.openxmlformats.org/officeDocument/2006/relationships" xmlns:m="http://schemas.openxmlformats.org/officeDocument/2006/math" xmlns:v="urn:schemas-microsoft-com:vml" xmlns:wp14="http://schemas.microsoft.com/office/word/2010/wordprocessingDrawing" xmlns:wp="http://schemas.openxmlformats.org/drawingml/2006/wordprocessingDrawing" xmlns:w10="urn:schemas-microsoft-com:office:word" xmlns:w="http://schemas.openxmlformats.org/wordprocessingml/2006/main" xmlns:w14="http://schemas.microsoft.com/office/word/2010/wordml" xmlns:w15="http://schemas.microsoft.com/office/word/2012/wordml" xmlns:w16cex="http://schemas.microsoft.com/office/word/2018/wordml/cex" xmlns:w16cid="http://schemas.microsoft.com/office/word/2016/wordml/cid" xmlns:w16="http://schemas.microsoft.com/office/word/2018/wordml" xmlns:w16du="http://schemas.microsoft.com/office/word/2023/wordml/word16du" xmlns:w16sdtdh="http://schemas.microsoft.com/office/word/2020/wordml/sdtdatahash" xmlns:w16sdtfl="http://schemas.microsoft.com/office/word/2024/wordml/sdtformatlock" xmlns:w16se="http://schemas.microsoft.com/office/word/2015/wordml/symex" xmlns:wpg="http://schemas.microsoft.com/office/word/2010/wordprocessingGroup" xmlns:wpi="http://schemas.microsoft.com/office/word/2010/wordprocessingInk" xmlns:wne="http://schemas.microsoft.com/office/word/2006/wordml" xmlns:wps="http://schemas.microsoft.com/office/word/2010/wordprocessingShape" mc:Ignorable="w14 w15 w16se w16cid w16 w16cex w16sdtdh w16sdtfl w16du wp14">
   <w:p>
     <w:pPr>
       <w:pStyle w:val="Encabezado"/>
@@ -4992,7 +5130,7 @@
 </file>
 
 <file path=word/header2.xml><?xml version="1.0" encoding="utf-8"?>
-<w:hdr xmlns:wpc="http://schemas.microsoft.com/office/word/2010/wordprocessingCanvas" xmlns:cx="http://schemas.microsoft.com/office/drawing/2014/chartex" xmlns:cx1="http://schemas.microsoft.com/office/drawing/2015/9/8/chartex" xmlns:cx2="http://schemas.microsoft.com/office/drawing/2015/10/21/chartex" xmlns:cx3="http://schemas.microsoft.com/office/drawing/2016/5/9/chartex" xmlns:cx4="http://schemas.microsoft.com/office/drawing/2016/5/10/chartex" xmlns:cx5="http://schemas.microsoft.com/office/drawing/2016/5/11/chartex" xmlns:cx6="http://schemas.microsoft.com/office/drawing/2016/5/12/chartex" xmlns:cx7="http://schemas.microsoft.com/office/drawing/2016/5/13/chartex" xmlns:cx8="http://schemas.microsoft.com/office/drawing/2016/5/14/chartex" xmlns:mc="http://schemas.openxmlformats.org/markup-compatibility/2006" xmlns:aink="http://schemas.microsoft.com/office/drawing/2016/ink" xmlns:am3d="http://schemas.microsoft.com/office/drawing/2017/model3d" xmlns:o="urn:schemas-microsoft-com:office:office" xmlns:oel="http://schemas.microsoft.com/office/2019/extlst" xmlns:r="http://schemas.openxmlformats.org/officeDocument/2006/relationships" xmlns:m="http://schemas.openxmlformats.org/officeDocument/2006/math" xmlns:v="urn:schemas-microsoft-com:vml" xmlns:wp14="http://schemas.microsoft.com/office/word/2010/wordprocessingDrawing" xmlns:wp="http://schemas.openxmlformats.org/drawingml/2006/wordprocessingDrawing" xmlns:w10="urn:schemas-microsoft-com:office:word" xmlns:w="http://schemas.openxmlformats.org/wordprocessingml/2006/main" xmlns:w14="http://schemas.microsoft.com/office/word/2010/wordml" xmlns:w15="http://schemas.microsoft.com/office/word/2012/wordml" xmlns:w16cei="http://schemas.microsoft.com/office/word/2026/wordml/cei" xmlns:w16cex="http://schemas.microsoft.com/office/word/2018/wordml/cex" xmlns:w16cid="http://schemas.microsoft.com/office/word/2016/wordml/cid" xmlns:w16="http://schemas.microsoft.com/office/word/2018/wordml" xmlns:w16du="http://schemas.microsoft.com/office/word/2023/wordml/word16du" xmlns:w16sdtdh="http://schemas.microsoft.com/office/word/2020/wordml/sdtdatahash" xmlns:w16sdtfl="http://schemas.microsoft.com/office/word/2024/wordml/sdtformatlock" xmlns:w16se="http://schemas.microsoft.com/office/word/2015/wordml/symex" xmlns:wpg="http://schemas.microsoft.com/office/word/2010/wordprocessingGroup" xmlns:wpi="http://schemas.microsoft.com/office/word/2010/wordprocessingInk" xmlns:wne="http://schemas.microsoft.com/office/word/2006/wordml" xmlns:wps="http://schemas.microsoft.com/office/word/2010/wordprocessingShape" mc:Ignorable="w14 w15 w16se w16cid w16 w16cex w16sdtdh w16sdtfl w16du wp14">
+<w:hdr xmlns:wpc="http://schemas.microsoft.com/office/word/2010/wordprocessingCanvas" xmlns:cx="http://schemas.microsoft.com/office/drawing/2014/chartex" xmlns:cx1="http://schemas.microsoft.com/office/drawing/2015/9/8/chartex" xmlns:cx2="http://schemas.microsoft.com/office/drawing/2015/10/21/chartex" xmlns:cx3="http://schemas.microsoft.com/office/drawing/2016/5/9/chartex" xmlns:cx4="http://schemas.microsoft.com/office/drawing/2016/5/10/chartex" xmlns:cx5="http://schemas.microsoft.com/office/drawing/2016/5/11/chartex" xmlns:cx6="http://schemas.microsoft.com/office/drawing/2016/5/12/chartex" xmlns:cx7="http://schemas.microsoft.com/office/drawing/2016/5/13/chartex" xmlns:cx8="http://schemas.microsoft.com/office/drawing/2016/5/14/chartex" xmlns:mc="http://schemas.openxmlformats.org/markup-compatibility/2006" xmlns:aink="http://schemas.microsoft.com/office/drawing/2016/ink" xmlns:am3d="http://schemas.microsoft.com/office/drawing/2017/model3d" xmlns:o="urn:schemas-microsoft-com:office:office" xmlns:oel="http://schemas.microsoft.com/office/2019/extlst" xmlns:r="http://schemas.openxmlformats.org/officeDocument/2006/relationships" xmlns:m="http://schemas.openxmlformats.org/officeDocument/2006/math" xmlns:v="urn:schemas-microsoft-com:vml" xmlns:wp14="http://schemas.microsoft.com/office/word/2010/wordprocessingDrawing" xmlns:wp="http://schemas.openxmlformats.org/drawingml/2006/wordprocessingDrawing" xmlns:w10="urn:schemas-microsoft-com:office:word" xmlns:w="http://schemas.openxmlformats.org/wordprocessingml/2006/main" xmlns:w14="http://schemas.microsoft.com/office/word/2010/wordml" xmlns:w15="http://schemas.microsoft.com/office/word/2012/wordml" xmlns:w16cex="http://schemas.microsoft.com/office/word/2018/wordml/cex" xmlns:w16cid="http://schemas.microsoft.com/office/word/2016/wordml/cid" xmlns:w16="http://schemas.microsoft.com/office/word/2018/wordml" xmlns:w16du="http://schemas.microsoft.com/office/word/2023/wordml/word16du" xmlns:w16sdtdh="http://schemas.microsoft.com/office/word/2020/wordml/sdtdatahash" xmlns:w16sdtfl="http://schemas.microsoft.com/office/word/2024/wordml/sdtformatlock" xmlns:w16se="http://schemas.microsoft.com/office/word/2015/wordml/symex" xmlns:wpg="http://schemas.microsoft.com/office/word/2010/wordprocessingGroup" xmlns:wpi="http://schemas.microsoft.com/office/word/2010/wordprocessingInk" xmlns:wne="http://schemas.microsoft.com/office/word/2006/wordml" xmlns:wps="http://schemas.microsoft.com/office/word/2010/wordprocessingShape" mc:Ignorable="w14 w15 w16se w16cid w16 w16cex w16sdtdh w16sdtfl w16du wp14">
   <w:p>
     <w:pPr>
       <w:pStyle w:val="Encabezado"/>
@@ -5002,7 +5140,7 @@
 </file>
 
 <file path=word/header3.xml><?xml version="1.0" encoding="utf-8"?>
-<w:hdr xmlns:wpc="http://schemas.microsoft.com/office/word/2010/wordprocessingCanvas" xmlns:cx="http://schemas.microsoft.com/office/drawing/2014/chartex" xmlns:cx1="http://schemas.microsoft.com/office/drawing/2015/9/8/chartex" xmlns:cx2="http://schemas.microsoft.com/office/drawing/2015/10/21/chartex" xmlns:cx3="http://schemas.microsoft.com/office/drawing/2016/5/9/chartex" xmlns:cx4="http://schemas.microsoft.com/office/drawing/2016/5/10/chartex" xmlns:cx5="http://schemas.microsoft.com/office/drawing/2016/5/11/chartex" xmlns:cx6="http://schemas.microsoft.com/office/drawing/2016/5/12/chartex" xmlns:cx7="http://schemas.microsoft.com/office/drawing/2016/5/13/chartex" xmlns:cx8="http://schemas.microsoft.com/office/drawing/2016/5/14/chartex" xmlns:mc="http://schemas.openxmlformats.org/markup-compatibility/2006" xmlns:aink="http://schemas.microsoft.com/office/drawing/2016/ink" xmlns:am3d="http://schemas.microsoft.com/office/drawing/2017/model3d" xmlns:o="urn:schemas-microsoft-com:office:office" xmlns:oel="http://schemas.microsoft.com/office/2019/extlst" xmlns:r="http://schemas.openxmlformats.org/officeDocument/2006/relationships" xmlns:m="http://schemas.openxmlformats.org/officeDocument/2006/math" xmlns:v="urn:schemas-microsoft-com:vml" xmlns:wp14="http://schemas.microsoft.com/office/word/2010/wordprocessingDrawing" xmlns:wp="http://schemas.openxmlformats.org/drawingml/2006/wordprocessingDrawing" xmlns:w10="urn:schemas-microsoft-com:office:word" xmlns:w="http://schemas.openxmlformats.org/wordprocessingml/2006/main" xmlns:w14="http://schemas.microsoft.com/office/word/2010/wordml" xmlns:w15="http://schemas.microsoft.com/office/word/2012/wordml" xmlns:w16cei="http://schemas.microsoft.com/office/word/2026/wordml/cei" xmlns:w16cex="http://schemas.microsoft.com/office/word/2018/wordml/cex" xmlns:w16cid="http://schemas.microsoft.com/office/word/2016/wordml/cid" xmlns:w16="http://schemas.microsoft.com/office/word/2018/wordml" xmlns:w16du="http://schemas.microsoft.com/office/word/2023/wordml/word16du" xmlns:w16sdtdh="http://schemas.microsoft.com/office/word/2020/wordml/sdtdatahash" xmlns:w16sdtfl="http://schemas.microsoft.com/office/word/2024/wordml/sdtformatlock" xmlns:w16se="http://schemas.microsoft.com/office/word/2015/wordml/symex" xmlns:wpg="http://schemas.microsoft.com/office/word/2010/wordprocessingGroup" xmlns:wpi="http://schemas.microsoft.com/office/word/2010/wordprocessingInk" xmlns:wne="http://schemas.microsoft.com/office/word/2006/wordml" xmlns:wps="http://schemas.microsoft.com/office/word/2010/wordprocessingShape" mc:Ignorable="w14 w15 w16se w16cid w16 w16cex w16sdtdh w16sdtfl w16du wp14">
+<w:hdr xmlns:wpc="http://schemas.microsoft.com/office/word/2010/wordprocessingCanvas" xmlns:cx="http://schemas.microsoft.com/office/drawing/2014/chartex" xmlns:cx1="http://schemas.microsoft.com/office/drawing/2015/9/8/chartex" xmlns:cx2="http://schemas.microsoft.com/office/drawing/2015/10/21/chartex" xmlns:cx3="http://schemas.microsoft.com/office/drawing/2016/5/9/chartex" xmlns:cx4="http://schemas.microsoft.com/office/drawing/2016/5/10/chartex" xmlns:cx5="http://schemas.microsoft.com/office/drawing/2016/5/11/chartex" xmlns:cx6="http://schemas.microsoft.com/office/drawing/2016/5/12/chartex" xmlns:cx7="http://schemas.microsoft.com/office/drawing/2016/5/13/chartex" xmlns:cx8="http://schemas.microsoft.com/office/drawing/2016/5/14/chartex" xmlns:mc="http://schemas.openxmlformats.org/markup-compatibility/2006" xmlns:aink="http://schemas.microsoft.com/office/drawing/2016/ink" xmlns:am3d="http://schemas.microsoft.com/office/drawing/2017/model3d" xmlns:o="urn:schemas-microsoft-com:office:office" xmlns:oel="http://schemas.microsoft.com/office/2019/extlst" xmlns:r="http://schemas.openxmlformats.org/officeDocument/2006/relationships" xmlns:m="http://schemas.openxmlformats.org/officeDocument/2006/math" xmlns:v="urn:schemas-microsoft-com:vml" xmlns:wp14="http://schemas.microsoft.com/office/word/2010/wordprocessingDrawing" xmlns:wp="http://schemas.openxmlformats.org/drawingml/2006/wordprocessingDrawing" xmlns:w10="urn:schemas-microsoft-com:office:word" xmlns:w="http://schemas.openxmlformats.org/wordprocessingml/2006/main" xmlns:w14="http://schemas.microsoft.com/office/word/2010/wordml" xmlns:w15="http://schemas.microsoft.com/office/word/2012/wordml" xmlns:w16cex="http://schemas.microsoft.com/office/word/2018/wordml/cex" xmlns:w16cid="http://schemas.microsoft.com/office/word/2016/wordml/cid" xmlns:w16="http://schemas.microsoft.com/office/word/2018/wordml" xmlns:w16du="http://schemas.microsoft.com/office/word/2023/wordml/word16du" xmlns:w16sdtdh="http://schemas.microsoft.com/office/word/2020/wordml/sdtdatahash" xmlns:w16sdtfl="http://schemas.microsoft.com/office/word/2024/wordml/sdtformatlock" xmlns:w16se="http://schemas.microsoft.com/office/word/2015/wordml/symex" xmlns:wpg="http://schemas.microsoft.com/office/word/2010/wordprocessingGroup" xmlns:wpi="http://schemas.microsoft.com/office/word/2010/wordprocessingInk" xmlns:wne="http://schemas.microsoft.com/office/word/2006/wordml" xmlns:wps="http://schemas.microsoft.com/office/word/2010/wordprocessingShape" mc:Ignorable="w14 w15 w16se w16cid w16 w16cex w16sdtdh w16sdtfl w16du wp14">
   <w:p>
     <w:pPr>
       <w:pStyle w:val="Encabezado"/>

</xml_diff>